<commit_message>
ACDR2026: update Chairman opening remarks with 2026 disasters and member count
Co-Authored-By: Claude Fable 5.1 <noreply@anthropic.com>
Claude-Session: https://claude.ai/code/session_01BHBsW6jxyH2X7L51FtZqxc
</commit_message>
<xml_diff>
--- a/reports/acdr2026_staff_deployment/進行シナリオ_0929/ACDR2026_Opening_Remarks_MIURA_案0929.docx
+++ b/reports/acdr2026_staff_deployment/進行シナリオ_0929/ACDR2026_Opening_Remarks_MIURA_案0929.docx
@@ -55,7 +55,7 @@
         <w:rPr>
           <w:b w:val="0"/>
         </w:rPr>
-        <w:t>本年もアジア各地で災害が相次ぎました。【要更新：ADRC 災害レポートから2026年の主な災害を2〜3件（発生月・国・規模）。例：7月の熊本地震、モンスーン期の洪水など】。被災された方々に心より哀悼の意を表します。これらの出来事は、気候変動と急速な都市化のもとで、災害リスクが国境を越えて連鎖することを改めて示しています。</w:t>
+        <w:t>本年もアジア各地で災害が相次ぎました。6月にはフィリピン・ミンダナオ島でマグニチュード7.8の地震が発生し、地震に伴う地すべりなどにより100名前後の方が犠牲となりました。8月にはインドネシア・フローレス島沖でマグニチュード7.7の地震が発生し、80名近くが犠牲となり、約2万9千戸の住家が被害を受けました。同じ8月末には、ネパールのトリスリ川流域を氷河崩壊に起因する巨大な土石流が襲い、1,400名以上が亡くなり、数千名が行方不明となりました。さらにモンスーン期には、多くの国で洪水による被害が生じました。被災された方々に心より哀悼の意を表します。これらの出来事は、気候変動と急速な都市化のもとで、災害リスクが国境を越えて連鎖することを改めて示しています。</w:t>
       </w:r>
     </w:p>
     <w:p>
@@ -79,7 +79,7 @@
         <w:rPr>
           <w:b w:val="0"/>
         </w:rPr>
-        <w:t>アジア防災センターは、33の加盟国とともに【要確認】、衛星データで被災地を迅速に把握する「センチネルアジア」、世界共通の災害識別番号「GLIDE」、災害情報の共有基盤づくりなど、現場と科学を結ぶ取り組みを進めています。この2日間の議論が、これらの仕組みをさらに実用的なものにする手がかりになることを期待しています。</w:t>
+        <w:t>アジア防災センターは、33の加盟国とともに、衛星データで被災地を迅速に把握する「センチネルアジア」、世界共通の災害識別番号「GLIDE」、災害情報の共有基盤づくりなど、現場と科学を結ぶ取り組みを進めています。この2日間の議論が、これらの仕組みをさらに実用的なものにする手がかりになることを期待しています。</w:t>
       </w:r>
     </w:p>
     <w:p>
@@ -150,7 +150,7 @@
         <w:rPr>
           <w:b w:val="0"/>
         </w:rPr>
-        <w:t>Asia has again experienced a series of disasters this year. [TO BE UPDATED from ADRC disaster reports: two or three major events of 2026 with month, country and scale.] I would like to express my deepest condolences to all those affected. These events remind us that, under climate change and rapid urbanisation, disaster risks cascade across borders.</w:t>
+        <w:t>Asia has again experienced a series of disasters this year. In June, a magnitude 7.8 earthquake struck Mindanao in the Philippines, claiming around one hundred lives, many of them in earthquake-triggered landslides. In August, a magnitude 7.7 earthquake off Flores Island, Indonesia, killed nearly eighty people and damaged some 29,000 houses. At the end of the same month, a massive debris flow originating from a glacier collapse swept down the Trishuli River in Nepal, leaving more than 1,400 people dead and several thousand missing. Monsoon floods have also caused heavy damage in many countries. I would like to express my deepest condolences to all those affected. These events remind us that, under climate change and rapid urbanisation, disaster risks cascade across borders.</w:t>
       </w:r>
     </w:p>
     <w:p>
@@ -174,7 +174,7 @@
         <w:rPr>
           <w:b w:val="0"/>
         </w:rPr>
-        <w:t>The Asian Disaster Reduction Center, together with its 33 member countries [to be confirmed], continues to connect science with practice through initiatives such as Sentinel Asia, which uses satellite data for rapid disaster assessment, GLIDE, the global disaster identifier, and platforms for sharing disaster information. I hope that the discussions over these two days will help make these mechanisms more practical and more widely used.</w:t>
+        <w:t>The Asian Disaster Reduction Center, together with its 33 member countries, continues to connect science with practice through initiatives such as Sentinel Asia, which uses satellite data for rapid disaster assessment, GLIDE, the global disaster identifier, and platforms for sharing disaster information. I hope that the discussions over these two days will help make these mechanisms more practical and more widely used.</w:t>
       </w:r>
     </w:p>
     <w:p>

</xml_diff>

<commit_message>
ACDR2026: closing remarks draft; scenario updates (YI-Lab speaker, photo duty, summary by DG)
Co-Authored-By: Claude Fable 5.1 <noreply@anthropic.com>
Claude-Session: https://claude.ai/code/session_01BHBsW6jxyH2X7L51FtZqxc
</commit_message>
<xml_diff>
--- a/reports/acdr2026_staff_deployment/進行シナリオ_0929/ACDR2026_Opening_Remarks_MIURA_案0929.docx
+++ b/reports/acdr2026_staff_deployment/進行シナリオ_0929/ACDR2026_Opening_Remarks_MIURA_案0929.docx
@@ -205,47 +205,7 @@
         <w:rPr>
           <w:b/>
         </w:rPr>
-        <w:t>【参考：閉会挨拶（29日 11:51、約3分）骨子】</w:t>
-      </w:r>
-    </w:p>
-    <w:p>
-      <w:r>
-        <w:rPr>
-          <w:b w:val="0"/>
-        </w:rPr>
-        <w:t>・2日間の御礼（SCDF・COSEM・内閣府・参加各国・登壇者・オンライン参加者）。</w:t>
-      </w:r>
-    </w:p>
-    <w:p>
-      <w:r>
-        <w:rPr>
-          <w:b w:val="0"/>
-        </w:rPr>
-        <w:t>・サマリーで示された要点への言及（RT: 各国の進捗と2030年までの課題／TS: 孤立地域を支える技術の実装条件）。</w:t>
-      </w:r>
-    </w:p>
-    <w:p>
-      <w:r>
-        <w:rPr>
-          <w:b w:val="0"/>
-        </w:rPr>
-        <w:t>・ADRC として持ち帰る事項（センチネルアジア・GLIDE 等の活用拡大、加盟国との協力）。</w:t>
-      </w:r>
-    </w:p>
-    <w:p>
-      <w:r>
-        <w:rPr>
-          <w:b w:val="0"/>
-        </w:rPr>
-        <w:t>・次回 ACDR（開催地・時期）の発表【TBC】。</w:t>
-      </w:r>
-    </w:p>
-    <w:p>
-      <w:r>
-        <w:rPr>
-          <w:b w:val="0"/>
-        </w:rPr>
-        <w:t>・午後のフィールドトリップ・パレードへの参加案内、再会の挨拶。</w:t>
+        <w:t>【閉会挨拶（29日 11:51、約3分）は別ファイル ACDR2026_Closing_Remarks_MIURA_案0929.docx】</w:t>
       </w:r>
     </w:p>
     <w:sectPr>

</xml_diff>

<commit_message>
ACDR2026: opening remarks rev2 (welcome, expectations, declaration of opening)
Co-Authored-By: Claude Fable 5.1 <noreply@anthropic.com>
Claude-Session: https://claude.ai/code/session_01BHBsW6jxyH2X7L51FtZqxc
</commit_message>
<xml_diff>
--- a/reports/acdr2026_staff_deployment/進行シナリオ_0929/ACDR2026_Opening_Remarks_MIURA_案0929.docx
+++ b/reports/acdr2026_staff_deployment/進行シナリオ_0929/ACDR2026_Opening_Remarks_MIURA_案0929.docx
@@ -7,7 +7,7 @@
         <w:rPr>
           <w:b/>
         </w:rPr>
-        <w:t>ACDR2026 Opening Remarks – 三浦　（案 2026-09-29／読み上げ約4分）</w:t>
+        <w:t>ACDR2026 Opening Remarks – 三浦センター長（Chairman）　（案 2026-09-30 rev2／28日 12:47、読み上げ約4分）</w:t>
       </w:r>
     </w:p>
     <w:p>
@@ -23,7 +23,7 @@
         <w:rPr>
           <w:b w:val="0"/>
         </w:rPr>
-        <w:t>皆さま、シンガポール民間防衛庁（SCDF）との共催により、SIDEX 2026 と合同で開催する「アジア防災会議2026（ACDR2026）」の開会にあたり、アジア防災センターを代表してごあいさつ申し上げます。</w:t>
+        <w:t>皆さま、こんにちは。シンガポール民間防衛庁（SCDF）との共催により、SIDEX 2026 と合同で開催する「アジア防災会議2026（ACDR2026）」の開会にあたり、アジア防災センターを代表してごあいさつ申し上げます。アジア各地からシンガポールにお集まりいただいた加盟国の代表、アドバイザー国、国際機関、登壇者、そしてオンラインで参加の皆さまを、心から歓迎いたします。</w:t>
       </w:r>
     </w:p>
     <w:p>
@@ -87,7 +87,7 @@
         <w:rPr>
           <w:b w:val="0"/>
         </w:rPr>
-        <w:t>本会議が、アジアの国々が経験を持ち寄り、信頼を深め、2030年に向けた共同行動を生み出す場となることを願い、私の挨拶といたします。ご参加を心より感謝申し上げます。</w:t>
+        <w:t>この2日間、各国の皆さまには率直なご報告を、登壇者の皆さまには活発な議論をお願いいたします。アジアの国々が経験を持ち寄り、信頼を深め、2030年に向けた共同行動を生み出す場としたいと思います。それでは、ここにアジア防災会議2026の開会を宣言いたします。実りある2日間となりますように。</w:t>
       </w:r>
     </w:p>
     <w:p>
@@ -118,7 +118,7 @@
         <w:rPr>
           <w:b w:val="0"/>
         </w:rPr>
-        <w:t>On behalf of the Asian Disaster Reduction Center, I am honoured to deliver these remarks at the opening of the Asian Conference on Disaster Reduction 2026, ACDR2026, co-hosted with the Singapore Civil Defence Force and held jointly with SIDEX 2026.</w:t>
+        <w:t>Good afternoon. On behalf of the Asian Disaster Reduction Center, I am honoured to open the Asian Conference on Disaster Reduction 2026, ACDR2026, co-hosted with the Singapore Civil Defence Force and held jointly with SIDEX 2026. A warm welcome to the delegates of our member countries, adviser countries and international organisations, to our speakers, and to those joining us online.</w:t>
       </w:r>
     </w:p>
     <w:p>
@@ -182,7 +182,7 @@
         <w:rPr>
           <w:b w:val="0"/>
         </w:rPr>
-        <w:t>I sincerely hope that ACDR2026 will serve as a platform where the countries of Asia share their experience, deepen mutual trust, and generate collective action towards 2030.</w:t>
+        <w:t>Over these two days, I ask each delegation to report candidly and each speaker to debate actively, so that ACDR2026 becomes a platform where the countries of Asia share their experience, deepen mutual trust, and generate collective action towards 2030. With that, I declare the Asian Conference on Disaster Reduction 2026 open. I wish you two fruitful days.</w:t>
       </w:r>
     </w:p>
     <w:p>
@@ -190,7 +190,7 @@
         <w:rPr>
           <w:b w:val="0"/>
         </w:rPr>
-        <w:t>Thank you very much.</w:t>
+        <w:t>Thank you.</w:t>
       </w:r>
     </w:p>
     <w:p>
@@ -205,7 +205,7 @@
         <w:rPr>
           <w:b/>
         </w:rPr>
-        <w:t>【閉会挨拶（29日 11:51、約3分）は三浦センター長（Chairman）。別ファイル ACDR2026_Closing_Remarks_MIURA_案0929.docx】</w:t>
+        <w:t>（閉会挨拶は別ファイル ACDR2026_Closing_Remarks_MIURA_案0929.docx）</w:t>
       </w:r>
     </w:p>
     <w:sectPr>

</xml_diff>

<commit_message>
ACDR2026: agenda 0930 (COJ, Joint Opening order, no co-moderator); opening remarks rev3 (3 min); scenario timings; drafts to Kodama and Yoshida
Co-Authored-By: Claude Fable 5.1 <noreply@anthropic.com>
Claude-Session: https://claude.ai/code/session_01BHBsW6jxyH2X7L51FtZqxc
</commit_message>
<xml_diff>
--- a/reports/acdr2026_staff_deployment/進行シナリオ_0929/ACDR2026_Opening_Remarks_MIURA_案0929.docx
+++ b/reports/acdr2026_staff_deployment/進行シナリオ_0929/ACDR2026_Opening_Remarks_MIURA_案0929.docx
@@ -7,7 +7,7 @@
         <w:rPr>
           <w:b/>
         </w:rPr>
-        <w:t>ACDR2026 Opening Remarks – 三浦センター長（Chairman）　（案 2026-09-30 rev2／28日 12:47、読み上げ約4分）</w:t>
+        <w:t>ACDR2026 Opening Remarks – 三浦センター長（Chairman）　（案 2026-09-30 rev3／28日 12:47、読み上げ約3分）</w:t>
       </w:r>
     </w:p>
     <w:p>
@@ -23,7 +23,7 @@
         <w:rPr>
           <w:b w:val="0"/>
         </w:rPr>
-        <w:t>皆さま、こんにちは。シンガポール民間防衛庁（SCDF）との共催により、SIDEX 2026 と合同で開催する「アジア防災会議2026（ACDR2026）」の開会にあたり、アジア防災センターを代表してごあいさつ申し上げます。アジア各地からシンガポールにお集まりいただいた加盟国の代表、アドバイザー国、国際機関、登壇者、そしてオンラインで参加の皆さまを、心から歓迎いたします。</w:t>
+        <w:t>皆さま、こんにちは。シンガポール民間防衛庁（SCDF）との共催により、SIDEX 2026 と合同で開催する「アジア防災会議2026（ACDR2026）」の開会にあたり、アジア防災センターを代表してごあいさつ申し上げます。加盟国、アドバイザー国、国際機関の代表、登壇者、そしてオンラインで参加の皆さまを心から歓迎します。開催にご尽力いただいたシンガポール政府、SCDF、COSEM、そして内閣府に深く感謝申し上げます。</w:t>
       </w:r>
     </w:p>
     <w:p>
@@ -31,7 +31,7 @@
         <w:rPr>
           <w:b w:val="0"/>
         </w:rPr>
-        <w:t>本会議の開催に向けてご尽力いただいたシンガポール政府、SCDF、COSEM の皆さま、そして内閣府をはじめ、参加国、国際機関、関係者の皆さまに深く敬意を表します。</w:t>
+        <w:t>本年は日本とシンガポールの外交関係樹立60周年にあたり、両国の防災機関が並んでこの会議を主催できることを大変嬉しく思います。また、東日本大震災から15年、そして仙台防災枠組の目標年である2030年まで残り4年の年でもあります。</w:t>
       </w:r>
     </w:p>
     <w:p>
@@ -39,7 +39,7 @@
         <w:rPr>
           <w:b w:val="0"/>
         </w:rPr>
-        <w:t>本年は、日本とシンガポールの外交関係樹立60周年にあたります。この節目の年に、両国の防災機関が並んで会議を主催できることを大変嬉しく思います。</w:t>
+        <w:t>本年もアジアは、6月のミンダナオ地震、8月のフローレス島沖地震、ネパール・トリスリ川の土石流、そして各国のモンスーン期の洪水に見舞われました。被災された方々に心より哀悼の意を表します。これらは、気候変動と急速な都市化のもとで災害リスクが国境を越えて連鎖することを示しています。だからこそ本会議のテーマを「先端技術で未来に備える越境的な気候・災害リスク削減 ― 強靭な社会に向けて」としました。</w:t>
       </w:r>
     </w:p>
     <w:p>
@@ -47,7 +47,7 @@
         <w:rPr>
           <w:b w:val="0"/>
         </w:rPr>
-        <w:t>また2026年は、東日本大震災から15年の年であり、仙台防災枠組の目標年である2030年まで、残り4年となりました。</w:t>
+        <w:t>本日午後と明朝のラウンドテーブルでは、各国から仙台防災枠組の進捗と残された課題をご報告いただきます。明日のテクニカルセッションでは、衛星観測、AI、通信技術が孤立・アクセス困難地域の人々をどう守れるかを議論します。その後、民間防衛アカデミーの視察と SCDF パレード、金曜日には SIDEX-ACDR 会議が続きます。</w:t>
       </w:r>
     </w:p>
     <w:p>
@@ -55,7 +55,7 @@
         <w:rPr>
           <w:b w:val="0"/>
         </w:rPr>
-        <w:t>本年もアジア各地で災害が相次ぎました。6月にはフィリピン・ミンダナオ島でマグニチュード7.8の地震が発生し、地震に伴う地すべりなどにより100名前後の方が犠牲となりました。8月にはインドネシア・フローレス島沖でマグニチュード7.7の地震が発生し、80名近くが犠牲となり、約2万9千戸の住家が被害を受けました。同じ8月末には、ネパールのトリスリ川流域を氷河崩壊に起因する巨大な土石流が襲い、1,400名以上が亡くなり、数千名が行方不明となりました。さらにモンスーン期には、多くの国で洪水による被害が生じました。被災された方々に心より哀悼の意を表します。これらの出来事は、気候変動と急速な都市化のもとで、災害リスクが国境を越えて連鎖することを改めて示しています。</w:t>
+        <w:t>アジア防災センターは33の加盟国とともに、センチネルアジア、GLIDE、災害情報の共有を通じて科学と現場を結んでいます。各国の皆さまには率直なご報告を、登壇者の皆さまには活発な議論をお願いし、この会議が信頼を深め、2030年に向けた共同行動を生み出す場となることを願います。</w:t>
       </w:r>
     </w:p>
     <w:p>
@@ -63,31 +63,7 @@
         <w:rPr>
           <w:b w:val="0"/>
         </w:rPr>
-        <w:t>こうした認識から、ACDR2026 のテーマを「先端技術で未来に備える越境的な気候・災害リスク削減 ― 強靭な社会に向けて」としました。</w:t>
-      </w:r>
-    </w:p>
-    <w:p>
-      <w:r>
-        <w:rPr>
-          <w:b w:val="0"/>
-        </w:rPr>
-        <w:t>本日午後のラウンドテーブルでは、各国から仙台防災枠組の進捗と残された課題をご報告いただきます。明日の朝に第2部を続けたうえで、テクニカルセッション「孤立・アクセス困難地域のための防災DX」において、衛星観測、AI、通信技術が、取り残されがちな地域の人々をどのように守れるかを議論します。明日午後には民間防衛アカデミーの視察と SCDF パレード、30日には SIDEX-ACDR 2026 会議が予定されています。展示会場では日本パビリオンをはじめ、各国の最新技術に触れることができます。</w:t>
-      </w:r>
-    </w:p>
-    <w:p>
-      <w:r>
-        <w:rPr>
-          <w:b w:val="0"/>
-        </w:rPr>
-        <w:t>アジア防災センターは、33の加盟国とともに、衛星データで被災地を迅速に把握する「センチネルアジア」、世界共通の災害識別番号「GLIDE」、災害情報の共有基盤づくりなど、現場と科学を結ぶ取り組みを進めています。この2日間の議論が、これらの仕組みをさらに実用的なものにする手がかりになることを期待しています。</w:t>
-      </w:r>
-    </w:p>
-    <w:p>
-      <w:r>
-        <w:rPr>
-          <w:b w:val="0"/>
-        </w:rPr>
-        <w:t>この2日間、各国の皆さまには率直なご報告を、登壇者の皆さまには活発な議論をお願いいたします。アジアの国々が経験を持ち寄り、信頼を深め、2030年に向けた共同行動を生み出す場としたいと思います。それでは、ここにアジア防災会議2026の開会を宣言いたします。実りある2日間となりますように。</w:t>
+        <w:t>それでは、ここにアジア防災会議2026の開会を宣言いたします。ありがとうございました。</w:t>
       </w:r>
     </w:p>
     <w:p>
@@ -110,7 +86,7 @@
         <w:rPr>
           <w:b w:val="0"/>
         </w:rPr>
-        <w:t>Distinguished guests, ladies and gentlemen,</w:t>
+        <w:t>Good afternoon, Excellencies, distinguished delegates, ladies and gentlemen.</w:t>
       </w:r>
     </w:p>
     <w:p>
@@ -118,7 +94,7 @@
         <w:rPr>
           <w:b w:val="0"/>
         </w:rPr>
-        <w:t>Good afternoon. On behalf of the Asian Disaster Reduction Center, I am honoured to open the Asian Conference on Disaster Reduction 2026, ACDR2026, co-hosted with the Singapore Civil Defence Force and held jointly with SIDEX 2026. A warm welcome to the delegates of our member countries, adviser countries and international organisations, to our speakers, and to those joining us online.</w:t>
+        <w:t>On behalf of the Asian Disaster Reduction Center, I am honoured to open the Asian Conference on Disaster Reduction 2026, co-hosted with the Singapore Civil Defence Force and held jointly with SIDEX 2026. A warm welcome to the delegates of our member countries, adviser countries and international organisations, to our speakers, and to those joining us online. I thank the Government of Singapore, SCDF and COSEM, and the Cabinet Office of Japan for making this conference possible.</w:t>
       </w:r>
     </w:p>
     <w:p>
@@ -126,7 +102,7 @@
         <w:rPr>
           <w:b w:val="0"/>
         </w:rPr>
-        <w:t>I wish to extend my sincere appreciation to the Government of Singapore, the Singapore Civil Defence Force and COSEM, to the Cabinet Office of Japan, and to the participating countries, international organisations and partners who have made this conference possible.</w:t>
+        <w:t>This year marks the 60th anniversary of diplomatic relations between Japan and Singapore, and I am pleased that the disaster management agencies of our two countries stand side by side as hosts. It is also fifteen years since the Great East Japan Earthquake, and only four years remain to the target year of the Sendai Framework, 2030.</w:t>
       </w:r>
     </w:p>
     <w:p>
@@ -134,7 +110,7 @@
         <w:rPr>
           <w:b w:val="0"/>
         </w:rPr>
-        <w:t>This year marks the 60th anniversary of diplomatic relations between Japan and Singapore. I am truly pleased that, in this commemorative year, the disaster management agencies of our two countries stand side by side as hosts of this conference.</w:t>
+        <w:t>Asia has again suffered this year: the Mindanao earthquake in June, the Flores earthquake in August, the debris flow on the Trishuli River in Nepal, and monsoon floods in many countries. I express my deepest condolences to all those affected. These events remind us that disaster risks cascade across borders under climate change and rapid urbanisation. Hence our theme: “Future-Proofing Transboundary Climate and Disaster Risk Reduction through Advanced Technologies for a Resilient Society”.</w:t>
       </w:r>
     </w:p>
     <w:p>
@@ -142,7 +118,7 @@
         <w:rPr>
           <w:b w:val="0"/>
         </w:rPr>
-        <w:t>The year 2026 also marks fifteen years since the Great East Japan Earthquake, and leaves us only four years to the target year of the Sendai Framework for Disaster Risk Reduction, 2030.</w:t>
+        <w:t>This afternoon and tomorrow morning, the Roundtable will hear from each country on progress under the Sendai Framework and on the challenges that remain. Tomorrow’s Technical Session will examine how satellite observation, artificial intelligence and communication technologies can protect isolated and inaccessible communities. We will then visit the Civil Defence Academy and attend the SCDF Parade, and on Friday join the SIDEX-ACDR 2026 Conference.</w:t>
       </w:r>
     </w:p>
     <w:p>
@@ -150,7 +126,7 @@
         <w:rPr>
           <w:b w:val="0"/>
         </w:rPr>
-        <w:t>Asia has again experienced a series of disasters this year. In June, a magnitude 7.8 earthquake struck Mindanao in the Philippines, claiming around one hundred lives, many of them in earthquake-triggered landslides. In August, a magnitude 7.7 earthquake off Flores Island, Indonesia, killed nearly eighty people and damaged some 29,000 houses. At the end of the same month, a massive debris flow originating from a glacier collapse swept down the Trishuli River in Nepal, leaving more than 1,400 people dead and several thousand missing. Monsoon floods have also caused heavy damage in many countries. I would like to express my deepest condolences to all those affected. These events remind us that, under climate change and rapid urbanisation, disaster risks cascade across borders.</w:t>
+        <w:t>ADRC, together with its 33 member countries, connects science with practice through Sentinel Asia, GLIDE and shared disaster information. I ask each delegation to report candidly and each speaker to debate actively, so that this conference deepens trust and generates collective action towards 2030.</w:t>
       </w:r>
     </w:p>
     <w:p>
@@ -158,39 +134,7 @@
         <w:rPr>
           <w:b w:val="0"/>
         </w:rPr>
-        <w:t>With this in mind, we have set the theme of ACDR2026 as “Future-Proofing Transboundary Climate and Disaster Risk Reduction through Advanced Technologies for a Resilient Society”.</w:t>
-      </w:r>
-    </w:p>
-    <w:p>
-      <w:r>
-        <w:rPr>
-          <w:b w:val="0"/>
-        </w:rPr>
-        <w:t>This afternoon, the Roundtable Session will hear from each country on the progress made under the Sendai Framework and the challenges that remain. After Part 2 tomorrow morning, the Technical Session on “DRR DX for Isolated and Inaccessible Regions” will examine how satellite observation, artificial intelligence and communication technologies can protect communities that are too easily left behind. Tomorrow afternoon we will visit the Civil Defence Academy and attend the SCDF Parade, and on Friday the SIDEX-ACDR 2026 Conference will follow. In the exhibition hall, including the Japan Pavilion, you will find the latest technologies from many countries.</w:t>
-      </w:r>
-    </w:p>
-    <w:p>
-      <w:r>
-        <w:rPr>
-          <w:b w:val="0"/>
-        </w:rPr>
-        <w:t>The Asian Disaster Reduction Center, together with its 33 member countries, continues to connect science with practice through initiatives such as Sentinel Asia, which uses satellite data for rapid disaster assessment, GLIDE, the global disaster identifier, and platforms for sharing disaster information. I hope that the discussions over these two days will help make these mechanisms more practical and more widely used.</w:t>
-      </w:r>
-    </w:p>
-    <w:p>
-      <w:r>
-        <w:rPr>
-          <w:b w:val="0"/>
-        </w:rPr>
-        <w:t>Over these two days, I ask each delegation to report candidly and each speaker to debate actively, so that ACDR2026 becomes a platform where the countries of Asia share their experience, deepen mutual trust, and generate collective action towards 2030. With that, I declare the Asian Conference on Disaster Reduction 2026 open. I wish you two fruitful days.</w:t>
-      </w:r>
-    </w:p>
-    <w:p>
-      <w:r>
-        <w:rPr>
-          <w:b w:val="0"/>
-        </w:rPr>
-        <w:t>Thank you.</w:t>
+        <w:t>With that, I declare the Asian Conference on Disaster Reduction 2026 open. Thank you.</w:t>
       </w:r>
     </w:p>
     <w:p>
@@ -203,9 +147,9 @@
     <w:p>
       <w:r>
         <w:rPr>
-          <w:b/>
+          <w:b w:val="0"/>
         </w:rPr>
-        <w:t>（閉会挨拶は別ファイル ACDR2026_Closing_Remarks_MIURA_案0929.docx）</w:t>
+        <w:t>（閉会挨拶は別ファイル ACDR2026_Closing_Remarks_MIURA_案0929.docx。4分版が必要な場合は rev2 の災害段落〈被害規模付き〉と展示会の一文を戻す。）</w:t>
       </w:r>
     </w:p>
     <w:sectPr>

</xml_diff>